<commit_message>
Lab 5-6 report: figure numbering lab.part.figure
</commit_message>
<xml_diff>
--- a/lab6/Lab5-6_ChirilMacari_FAF-243.docx
+++ b/lab6/Lab5-6_ChirilMacari_FAF-243.docx
@@ -867,7 +867,7 @@
         <w:pStyle w:val="Caption"/>
       </w:pPr>
       <w:r>
-        <w:t>Figure 1.1 – ls / and the types of five paths</w:t>
+        <w:t>Figure 1.1.1 – ls / and the types of five paths</w:t>
       </w:r>
     </w:p>
     <w:p>
@@ -916,7 +916,7 @@
         <w:pStyle w:val="Caption"/>
       </w:pPr>
       <w:r>
-        <w:t>Figure 1.2 – Devices in /dev and the output of file</w:t>
+        <w:t>Figure 1.1.2 – Devices in /dev and the output of file</w:t>
       </w:r>
     </w:p>
     <w:p>
@@ -965,7 +965,7 @@
         <w:pStyle w:val="Caption"/>
       </w:pPr>
       <w:r>
-        <w:t>Figure 1.3 – Size of /var/log and /usr</w:t>
+        <w:t>Figure 1.1.3 – Size of /var/log and /usr</w:t>
       </w:r>
     </w:p>
     <w:p>
@@ -1491,7 +1491,7 @@
         <w:pStyle w:val="Caption"/>
       </w:pPr>
       <w:r>
-        <w:t>Figure 2.1 – stat and ls -li of notes.txt</w:t>
+        <w:t>Figure 1.2.1 – stat and ls -li of notes.txt</w:t>
       </w:r>
     </w:p>
     <w:p>
@@ -1540,7 +1540,7 @@
         <w:pStyle w:val="Caption"/>
       </w:pPr>
       <w:r>
-        <w:t>Figure 2.2 – A hard link, then removing the original</w:t>
+        <w:t>Figure 1.2.2 – A hard link, then removing the original</w:t>
       </w:r>
     </w:p>
     <w:p>
@@ -1589,7 +1589,7 @@
         <w:pStyle w:val="Caption"/>
       </w:pPr>
       <w:r>
-        <w:t>Figure 2.3 – A symbolic link, then removing its target</w:t>
+        <w:t>Figure 1.2.3 – A symbolic link, then removing its target</w:t>
       </w:r>
     </w:p>
     <w:p>
@@ -1619,7 +1619,7 @@
       </w:r>
       <w:r>
         <w:rPr/>
-        <w:t xml:space="preserve"> after creating two subdirectories. Both predictions were correct (Figure 2.4).</w:t>
+        <w:t xml:space="preserve"> after creating two subdirectories. Both predictions were correct (Figure 1.2.4).</w:t>
       </w:r>
     </w:p>
     <w:p>
@@ -1668,7 +1668,7 @@
         <w:pStyle w:val="Caption"/>
       </w:pPr>
       <w:r>
-        <w:t>Figure 2.4 – Link count of a directory</w:t>
+        <w:t>Figure 1.2.4 – Link count of a directory</w:t>
       </w:r>
     </w:p>
     <w:p>
@@ -1717,7 +1717,7 @@
         <w:pStyle w:val="Caption"/>
       </w:pPr>
       <w:r>
-        <w:t>Figure 2.5 – Size is not space</w:t>
+        <w:t>Figure 1.2.5 – Size is not space</w:t>
       </w:r>
     </w:p>
     <w:p>
@@ -2273,7 +2273,7 @@
         <w:pStyle w:val="Caption"/>
       </w:pPr>
       <w:r>
-        <w:t>Figure 3.1 – chmod on a file and the umask</w:t>
+        <w:t>Figure 1.3.1 – chmod on a file and the umask</w:t>
       </w:r>
     </w:p>
     <w:p>
@@ -2747,7 +2747,7 @@
         <w:pStyle w:val="Caption"/>
       </w:pPr>
       <w:r>
-        <w:t>Figure 3.2 – The box experiment: r and x on a directory</w:t>
+        <w:t>Figure 1.3.2 – The box experiment: r and x on a directory</w:t>
       </w:r>
     </w:p>
     <w:p>
@@ -2796,7 +2796,7 @@
         <w:pStyle w:val="Caption"/>
       </w:pPr>
       <w:r>
-        <w:t>Figure 3.3 – The special bits and /etc/shadow</w:t>
+        <w:t>Figure 1.3.3 – The special bits and /etc/shadow</w:t>
       </w:r>
     </w:p>
     <w:p>
@@ -3490,7 +3490,7 @@
         <w:pStyle w:val="Caption"/>
       </w:pPr>
       <w:r>
-        <w:t>Figure 4.1 – lsblk</w:t>
+        <w:t>Figure 1.4.1 – lsblk</w:t>
       </w:r>
     </w:p>
     <w:p>
@@ -3539,7 +3539,7 @@
         <w:pStyle w:val="Caption"/>
       </w:pPr>
       <w:r>
-        <w:t>Figure 4.2 – df -h and the root mount</w:t>
+        <w:t>Figure 1.4.2 – df -h and the root mount</w:t>
       </w:r>
     </w:p>
     <w:p>
@@ -3588,7 +3588,7 @@
         <w:pStyle w:val="Caption"/>
       </w:pPr>
       <w:r>
-        <w:t>Figure 4.3 – CPU, memory and the current process in /proc</w:t>
+        <w:t>Figure 1.4.3 – CPU, memory and the current process in /proc</w:t>
       </w:r>
     </w:p>
     <w:p>
@@ -4121,7 +4121,7 @@
         <w:pStyle w:val="Caption"/>
       </w:pPr>
       <w:r>
-        <w:t>Figure 5.1 – Magic numbers of a gzip file</w:t>
+        <w:t>Figure 1.5.1 – Magic numbers of a gzip file</w:t>
       </w:r>
     </w:p>
     <w:p>
@@ -4219,7 +4219,7 @@
         <w:pStyle w:val="Caption"/>
       </w:pPr>
       <w:r>
-        <w:t>Figure 5.2 – A deleted file that is still open</w:t>
+        <w:t>Figure 1.5.2 – A deleted file that is still open</w:t>
       </w:r>
     </w:p>
     <w:p>
@@ -4510,7 +4510,7 @@
         <w:pStyle w:val="Caption"/>
       </w:pPr>
       <w:r>
-        <w:t>Figure 1.1 – The file types in kernel/stat.h</w:t>
+        <w:t>Figure 2.1.1 – The file types in kernel/stat.h</w:t>
       </w:r>
     </w:p>
     <w:p>
@@ -4559,7 +4559,7 @@
         <w:pStyle w:val="Caption"/>
       </w:pPr>
       <w:r>
-        <w:t>Figure 1.2 – ls in xv6 on a fresh disk</w:t>
+        <w:t>Figure 2.1.2 – ls in xv6 on a fresh disk</w:t>
       </w:r>
     </w:p>
     <w:p>
@@ -4684,7 +4684,7 @@
         <w:pStyle w:val="Caption"/>
       </w:pPr>
       <w:r>
-        <w:t>Figure 1.3 – ls of a new empty directory a</w:t>
+        <w:t>Figure 2.1.3 – ls of a new empty directory a</w:t>
       </w:r>
     </w:p>
     <w:p>
@@ -5101,7 +5101,7 @@
         <w:pStyle w:val="Caption"/>
       </w:pPr>
       <w:r>
-        <w:t>Figure 2.1 – user/mystat.c and the UPROGS line</w:t>
+        <w:t>Figure 2.2.1 – user/mystat.c and the UPROGS line</w:t>
       </w:r>
     </w:p>
     <w:p>
@@ -5150,7 +5150,7 @@
         <w:pStyle w:val="Caption"/>
       </w:pPr>
       <w:r>
-        <w:t>Figure 2.2 – mystat with a hard link and after rm</w:t>
+        <w:t>Figure 2.2.2 – mystat with a hard link and after rm</w:t>
       </w:r>
     </w:p>
     <w:p>
@@ -5199,7 +5199,7 @@
         <w:pStyle w:val="Caption"/>
       </w:pPr>
       <w:r>
-        <w:t>Figure 2.3 – sys_unlink decrements nlink, and iput frees the blocks</w:t>
+        <w:t>Figure 2.2.3 – sys_unlink decrements nlink, and iput frees the blocks</w:t>
       </w:r>
     </w:p>
     <w:p>
@@ -5248,7 +5248,7 @@
         <w:pStyle w:val="Caption"/>
       </w:pPr>
       <w:r>
-        <w:t>Figure 2.4 – struct dinode in kernel/fs.h</w:t>
+        <w:t>Figure 2.2.4 – struct dinode in kernel/fs.h</w:t>
       </w:r>
     </w:p>
     <w:p>
@@ -5762,7 +5762,7 @@
         <w:pStyle w:val="Caption"/>
       </w:pPr>
       <w:r>
-        <w:t>Figure 3.1 – The limits in kernel/fs.h</w:t>
+        <w:t>Figure 2.3.1 – The limits in kernel/fs.h</w:t>
       </w:r>
     </w:p>
     <w:p>
@@ -5811,7 +5811,7 @@
         <w:pStyle w:val="Caption"/>
       </w:pPr>
       <w:r>
-        <w:t>Figure 3.2 – The disk layout printed by mkfs</w:t>
+        <w:t>Figure 2.3.2 – The disk layout printed by mkfs</w:t>
       </w:r>
     </w:p>
     <w:p>
@@ -5860,7 +5860,7 @@
         <w:pStyle w:val="Caption"/>
       </w:pPr>
       <w:r>
-        <w:t>Figure 3.3 – A directory with a long name</w:t>
+        <w:t>Figure 2.3.3 – A directory with a long name</w:t>
       </w:r>
     </w:p>
     <w:p>
@@ -6946,7 +6946,7 @@
         <w:pStyle w:val="Caption"/>
       </w:pPr>
       <w:r>
-        <w:t>Figure 4.1 – The UPROGS lines for mystat and find</w:t>
+        <w:t>Figure 2.4.1 – The UPROGS lines for mystat and find</w:t>
       </w:r>
     </w:p>
     <w:p>
@@ -7055,7 +7055,7 @@
       </w:r>
       <w:r>
         <w:rPr/>
-        <w:t xml:space="preserve"> (Figure 4.3).</w:t>
+        <w:t xml:space="preserve"> (Figure 2.4.3).</w:t>
       </w:r>
     </w:p>
     <w:p>
@@ -7104,7 +7104,7 @@
         <w:pStyle w:val="Caption"/>
       </w:pPr>
       <w:r>
-        <w:t>Figure 4.2 – Testing find, and the -n stretch</w:t>
+        <w:t>Figure 2.4.2 – Testing find, and the -n stretch</w:t>
       </w:r>
     </w:p>
     <w:p>
@@ -7153,7 +7153,7 @@
         <w:pStyle w:val="Caption"/>
       </w:pPr>
       <w:r>
-        <w:t>Figure 4.3 – find a b typed again</w:t>
+        <w:t>Figure 2.4.3 – find a b typed again</w:t>
       </w:r>
     </w:p>
     <w:p>

</xml_diff>